<commit_message>
Removed old files and added New files
</commit_message>
<xml_diff>
--- a/Output- C Qns set 1.docx
+++ b/Output- C Qns set 1.docx
@@ -57,17 +57,9 @@
       </w:pPr>
       <w:r>
         <w:drawing>
-          <wp:anchor distT="0" distB="0" distL="114300" distR="114300" simplePos="0" relativeHeight="251658240" behindDoc="0" locked="0" layoutInCell="1" allowOverlap="1">
-            <wp:simplePos x="914400" y="1571625"/>
-            <wp:positionH relativeFrom="column">
-              <wp:align>left</wp:align>
-            </wp:positionH>
-            <wp:positionV relativeFrom="paragraph">
-              <wp:align>top</wp:align>
-            </wp:positionV>
-            <wp:extent cx="5943600" cy="2820035"/>
+          <wp:inline distT="0" distB="0" distL="0" distR="0" wp14:anchorId="0CD7C978" wp14:editId="3AE6529A">
+            <wp:extent cx="5943600" cy="2724150"/>
             <wp:effectExtent l="0" t="0" r="0" b="0"/>
-            <wp:wrapSquare wrapText="bothSides"/>
             <wp:docPr id="1" name="Picture 1"/>
             <wp:cNvGraphicFramePr>
               <a:graphicFrameLocks xmlns:a="http://schemas.openxmlformats.org/drawingml/2006/main" noChangeAspect="1"/>
@@ -80,13 +72,7 @@
                     <pic:cNvPicPr/>
                   </pic:nvPicPr>
                   <pic:blipFill>
-                    <a:blip r:embed="rId4">
-                      <a:extLst>
-                        <a:ext uri="{28A0092B-C50C-407E-A947-70E740481C1C}">
-                          <a14:useLocalDpi xmlns:a14="http://schemas.microsoft.com/office/drawing/2010/main" val="0"/>
-                        </a:ext>
-                      </a:extLst>
-                    </a:blip>
+                    <a:blip r:embed="rId4"/>
                     <a:stretch>
                       <a:fillRect/>
                     </a:stretch>
@@ -94,7 +80,7 @@
                   <pic:spPr>
                     <a:xfrm>
                       <a:off x="0" y="0"/>
-                      <a:ext cx="5943600" cy="2820035"/>
+                      <a:ext cx="5943600" cy="2724150"/>
                     </a:xfrm>
                     <a:prstGeom prst="rect">
                       <a:avLst/>
@@ -103,9 +89,11 @@
                 </pic:pic>
               </a:graphicData>
             </a:graphic>
-          </wp:anchor>
+          </wp:inline>
         </w:drawing>
       </w:r>
+      <w:bookmarkStart w:id="0" w:name="_GoBack"/>
+      <w:bookmarkEnd w:id="0"/>
       <w:r>
         <w:br w:type="textWrapping" w:clear="all"/>
       </w:r>
@@ -156,6 +144,10 @@
     </w:p>
     <w:p>
       <w:r>
+        <w:rPr>
+          <w:noProof/>
+          <w:lang w:bidi="ml-IN"/>
+        </w:rPr>
         <w:drawing>
           <wp:inline distT="0" distB="0" distL="0" distR="0" wp14:anchorId="79A9CBCD" wp14:editId="6C691F62">
             <wp:extent cx="5395428" cy="3749365"/>
@@ -218,27 +210,7 @@
           <w:u w:val="single"/>
         </w:rPr>
         <w:lastRenderedPageBreak/>
-        <w:t>4</w:t>
-      </w:r>
-      <w:r>
-        <w:rPr>
-          <w:b/>
-          <w:bCs/>
-          <w:sz w:val="32"/>
-          <w:szCs w:val="32"/>
-          <w:u w:val="single"/>
-        </w:rPr>
-        <w:t>.</w:t>
-      </w:r>
-      <w:r>
-        <w:rPr>
-          <w:b/>
-          <w:bCs/>
-          <w:sz w:val="32"/>
-          <w:szCs w:val="32"/>
-          <w:u w:val="single"/>
-        </w:rPr>
-        <w:t>Printing</w:t>
+        <w:t>4.Printing</w:t>
       </w:r>
       <w:proofErr w:type="gramEnd"/>
       <w:r>
@@ -254,11 +226,15 @@
     </w:p>
     <w:p>
       <w:r>
+        <w:rPr>
+          <w:noProof/>
+          <w:lang w:bidi="ml-IN"/>
+        </w:rPr>
         <w:drawing>
-          <wp:inline distT="0" distB="0" distL="0" distR="0" wp14:anchorId="3BA3C983" wp14:editId="7D271945">
-            <wp:extent cx="3619500" cy="7146925"/>
+          <wp:inline distT="0" distB="0" distL="0" distR="0" wp14:anchorId="3A4537C1" wp14:editId="10107C7F">
+            <wp:extent cx="5182049" cy="4656223"/>
             <wp:effectExtent l="0" t="0" r="0" b="0"/>
-            <wp:docPr id="3" name="Picture 3"/>
+            <wp:docPr id="4" name="Picture 4"/>
             <wp:cNvGraphicFramePr>
               <a:graphicFrameLocks xmlns:a="http://schemas.openxmlformats.org/drawingml/2006/main" noChangeAspect="1"/>
             </wp:cNvGraphicFramePr>
@@ -278,7 +254,7 @@
                   <pic:spPr>
                     <a:xfrm>
                       <a:off x="0" y="0"/>
-                      <a:ext cx="3622066" cy="7151992"/>
+                      <a:ext cx="5182049" cy="4656223"/>
                     </a:xfrm>
                     <a:prstGeom prst="rect">
                       <a:avLst/>
@@ -290,8 +266,6 @@
           </wp:inline>
         </w:drawing>
       </w:r>
-      <w:bookmarkStart w:id="0" w:name="_GoBack"/>
-      <w:bookmarkEnd w:id="0"/>
     </w:p>
     <w:sectPr>
       <w:pgSz w:w="12240" w:h="15840"/>

</xml_diff>